<commit_message>
created standards documentation for dfds
</commit_message>
<xml_diff>
--- a/01_Standards/Milestone_3_Components/M3_Standards_Documentation_for_Structure_Charts.docx
+++ b/01_Standards/Milestone_3_Components/M3_Standards_Documentation_for_Structure_Charts.docx
@@ -44,10 +44,9 @@
       </w:r>
       <w:r>
         <w:rPr>
-          <w:rFonts w:ascii="Arial" w:hAnsi="Arial" w:eastAsia="Arial" w:cs="Arial"/>
+          <w:rFonts w:ascii="Arial" w:hAnsi="Arial" w:cs="Arial"/>
           <w:sz w:val="28"/>
           <w:szCs w:val="28"/>
-          <w:highlight w:val="none"/>
         </w:rPr>
       </w:r>
       <w:r>
@@ -107,7 +106,7 @@
       </w:r>
       <w:r>
         <w:rPr>
-          <w:rFonts w:ascii="Arial" w:hAnsi="Arial" w:eastAsia="Arial" w:cs="Arial"/>
+          <w:rFonts w:ascii="Arial" w:hAnsi="Arial" w:cs="Arial"/>
           <w:sz w:val="28"/>
           <w:szCs w:val="28"/>
         </w:rPr>
@@ -191,7 +190,7 @@
             </w:r>
             <w:r>
               <w:rPr>
-                <w:rFonts w:ascii="Arial" w:hAnsi="Arial" w:eastAsia="Arial" w:cs="Arial"/>
+                <w:rFonts w:ascii="Arial" w:hAnsi="Arial" w:cs="Arial"/>
                 <w:sz w:val="28"/>
                 <w:szCs w:val="28"/>
               </w:rPr>
@@ -252,7 +251,7 @@
             </w:r>
             <w:r>
               <w:rPr>
-                <w:rFonts w:ascii="Arial" w:hAnsi="Arial" w:eastAsia="Arial" w:cs="Arial"/>
+                <w:rFonts w:ascii="Arial" w:hAnsi="Arial" w:cs="Arial"/>
                 <w:sz w:val="28"/>
                 <w:szCs w:val="28"/>
               </w:rPr>
@@ -318,7 +317,7 @@
             </w:r>
             <w:r>
               <w:rPr>
-                <w:rFonts w:ascii="Arial" w:hAnsi="Arial" w:eastAsia="Arial" w:cs="Arial"/>
+                <w:rFonts w:ascii="Arial" w:hAnsi="Arial" w:cs="Arial"/>
                 <w:sz w:val="28"/>
                 <w:szCs w:val="28"/>
               </w:rPr>
@@ -378,7 +377,7 @@
             </w:r>
             <w:r>
               <w:rPr>
-                <w:rFonts w:ascii="Arial" w:hAnsi="Arial" w:eastAsia="Arial" w:cs="Arial"/>
+                <w:rFonts w:ascii="Arial" w:hAnsi="Arial" w:cs="Arial"/>
                 <w:sz w:val="28"/>
                 <w:szCs w:val="28"/>
               </w:rPr>
@@ -443,7 +442,7 @@
             </w:r>
             <w:r>
               <w:rPr>
-                <w:rFonts w:ascii="Arial" w:hAnsi="Arial" w:eastAsia="Arial" w:cs="Arial"/>
+                <w:rFonts w:ascii="Arial" w:hAnsi="Arial" w:cs="Arial"/>
                 <w:sz w:val="28"/>
                 <w:szCs w:val="28"/>
               </w:rPr>
@@ -502,7 +501,7 @@
             </w:r>
             <w:r>
               <w:rPr>
-                <w:rFonts w:ascii="Arial" w:hAnsi="Arial" w:eastAsia="Arial" w:cs="Arial"/>
+                <w:rFonts w:ascii="Arial" w:hAnsi="Arial" w:cs="Arial"/>
                 <w:sz w:val="28"/>
                 <w:szCs w:val="28"/>
               </w:rPr>
@@ -568,7 +567,7 @@
             </w:r>
             <w:r>
               <w:rPr>
-                <w:rFonts w:ascii="Arial" w:hAnsi="Arial" w:eastAsia="Arial" w:cs="Arial"/>
+                <w:rFonts w:ascii="Arial" w:hAnsi="Arial" w:cs="Arial"/>
                 <w:sz w:val="28"/>
                 <w:szCs w:val="28"/>
               </w:rPr>
@@ -628,7 +627,7 @@
             </w:r>
             <w:r>
               <w:rPr>
-                <w:rFonts w:ascii="Arial" w:hAnsi="Arial" w:eastAsia="Arial" w:cs="Arial"/>
+                <w:rFonts w:ascii="Arial" w:hAnsi="Arial" w:cs="Arial"/>
                 <w:sz w:val="28"/>
                 <w:szCs w:val="28"/>
               </w:rPr>
@@ -1524,8 +1523,10 @@
       </w:r>
       <w:r>
         <w:rPr>
+          <w:rFonts w:ascii="Arial" w:hAnsi="Arial" w:eastAsia="Arial" w:cs="Arial"/>
           <w:b/>
           <w:bCs/>
+          <w:highlight w:val="none"/>
         </w:rPr>
       </w:r>
       <w:r>
@@ -1686,7 +1687,12 @@
         </w:rPr>
         <w:t xml:space="preserve">[chart] </w:t>
       </w:r>
-      <w:r/>
+      <w:r>
+        <w:rPr>
+          <w:rFonts w:ascii="Arial" w:hAnsi="Arial" w:eastAsia="Arial" w:cs="Arial"/>
+          <w:highlight w:val="none"/>
+        </w:rPr>
+      </w:r>
     </w:p>
     <w:p>
       <w:pPr>
@@ -1696,7 +1702,6 @@
         <w:contextualSpacing w:val="true"/>
         <w:rPr/>
       </w:pPr>
-      <w:r/>
       <w:r/>
       <w:r/>
     </w:p>
@@ -1708,7 +1713,6 @@
         <w:contextualSpacing w:val="true"/>
         <w:rPr/>
       </w:pPr>
-      <w:r/>
       <w:r/>
       <w:r/>
     </w:p>
@@ -1755,6 +1759,17 @@
           <w:highlight w:val="none"/>
         </w:rPr>
       </w:r>
+      <w:r>
+        <w:rPr>
+          <w:rFonts w:ascii="Arial" w:hAnsi="Arial" w:eastAsia="Arial" w:cs="Arial"/>
+          <w:b/>
+          <w:bCs/>
+          <w:color w:val="000000"/>
+          <w:sz w:val="28"/>
+          <w:szCs w:val="28"/>
+          <w:highlight w:val="none"/>
+        </w:rPr>
+      </w:r>
     </w:p>
     <w:p>
       <w:pPr>
@@ -1762,6 +1777,710 @@
         <w:spacing/>
         <w:ind/>
         <w:contextualSpacing w:val="true"/>
+        <w:rPr>
+          <w:rFonts w:ascii="Arial" w:hAnsi="Arial" w:eastAsia="Arial" w:cs="Arial"/>
+          <w:b/>
+          <w:bCs/>
+          <w:color w:val="000000"/>
+          <w:sz w:val="28"/>
+          <w:szCs w:val="28"/>
+          <w:highlight w:val="none"/>
+        </w:rPr>
+      </w:pPr>
+      <w:r>
+        <w:rPr>
+          <w:rFonts w:ascii="Arial" w:hAnsi="Arial" w:eastAsia="Arial" w:cs="Arial"/>
+          <w:b/>
+          <w:color w:val="000000"/>
+          <w:sz w:val="28"/>
+          <w:szCs w:val="28"/>
+          <w:highlight w:val="none"/>
+        </w:rPr>
+      </w:r>
+      <w:r>
+        <w:rPr>
+          <w:rFonts w:ascii="Arial" w:hAnsi="Arial" w:eastAsia="Arial" w:cs="Arial"/>
+          <w:b/>
+          <w:color w:val="000000"/>
+          <w:sz w:val="28"/>
+          <w:szCs w:val="28"/>
+          <w:highlight w:val="none"/>
+        </w:rPr>
+      </w:r>
+      <w:r>
+        <w:rPr>
+          <w:rFonts w:ascii="Arial" w:hAnsi="Arial" w:eastAsia="Arial" w:cs="Arial"/>
+          <w:b/>
+          <w:bCs/>
+          <w:color w:val="000000"/>
+          <w:sz w:val="28"/>
+          <w:szCs w:val="28"/>
+          <w:highlight w:val="none"/>
+        </w:rPr>
+      </w:r>
+    </w:p>
+    <w:p>
+      <w:pPr>
+        <w:pBdr/>
+        <w:spacing/>
+        <w:ind/>
+        <w:contextualSpacing w:val="true"/>
+        <w:rPr>
+          <w:sz w:val="22"/>
+          <w:szCs w:val="22"/>
+        </w:rPr>
+      </w:pPr>
+      <w:r>
+        <w:rPr>
+          <w:rFonts w:ascii="Arial" w:hAnsi="Arial" w:eastAsia="Arial" w:cs="Arial"/>
+          <w:b/>
+          <w:color w:val="000000"/>
+          <w:sz w:val="22"/>
+          <w:szCs w:val="22"/>
+          <w:highlight w:val="none"/>
+        </w:rPr>
+        <w:t xml:space="preserve">Structure Charts — Fictitious Service </w:t>
+      </w:r>
+      <w:r>
+        <w:rPr>
+          <w:sz w:val="18"/>
+          <w:szCs w:val="18"/>
+        </w:rPr>
+      </w:r>
+      <w:r>
+        <w:rPr>
+          <w:sz w:val="22"/>
+          <w:szCs w:val="22"/>
+        </w:rPr>
+      </w:r>
+    </w:p>
+    <w:p>
+      <w:pPr>
+        <w:pBdr/>
+        <w:spacing/>
+        <w:ind/>
+        <w:contextualSpacing w:val="true"/>
+        <w:rPr>
+          <w:sz w:val="22"/>
+          <w:szCs w:val="22"/>
+        </w:rPr>
+      </w:pPr>
+      <w:r>
+        <w:rPr>
+          <w:rFonts w:ascii="Arial" w:hAnsi="Arial" w:eastAsia="Arial" w:cs="Arial"/>
+          <w:b/>
+          <w:color w:val="000000"/>
+          <w:sz w:val="22"/>
+          <w:szCs w:val="22"/>
+          <w:highlight w:val="none"/>
+        </w:rPr>
+      </w:r>
+      <w:r>
+        <w:rPr>
+          <w:sz w:val="18"/>
+          <w:szCs w:val="18"/>
+        </w:rPr>
+      </w:r>
+      <w:r>
+        <w:rPr>
+          <w:sz w:val="22"/>
+          <w:szCs w:val="22"/>
+        </w:rPr>
+      </w:r>
+    </w:p>
+    <w:p>
+      <w:pPr>
+        <w:pBdr/>
+        <w:spacing/>
+        <w:ind/>
+        <w:contextualSpacing w:val="true"/>
+        <w:rPr>
+          <w:sz w:val="22"/>
+          <w:szCs w:val="22"/>
+        </w:rPr>
+      </w:pPr>
+      <w:r>
+        <w:rPr>
+          <w:rFonts w:ascii="Arial" w:hAnsi="Arial" w:eastAsia="Arial" w:cs="Arial"/>
+          <w:b/>
+          <w:color w:val="000000"/>
+          <w:sz w:val="22"/>
+          <w:szCs w:val="22"/>
+          <w:highlight w:val="none"/>
+        </w:rPr>
+        <w:t xml:space="preserve">SC Figure 1.16.0.1 — primaryFunction() </w:t>
+      </w:r>
+      <w:r>
+        <w:rPr>
+          <w:sz w:val="18"/>
+          <w:szCs w:val="18"/>
+        </w:rPr>
+      </w:r>
+      <w:r>
+        <w:rPr>
+          <w:sz w:val="22"/>
+          <w:szCs w:val="22"/>
+        </w:rPr>
+      </w:r>
+    </w:p>
+    <w:p>
+      <w:pPr>
+        <w:pBdr/>
+        <w:spacing/>
+        <w:ind/>
+        <w:contextualSpacing w:val="true"/>
+        <w:rPr>
+          <w:b w:val="0"/>
+          <w:bCs w:val="0"/>
+          <w:sz w:val="22"/>
+          <w:szCs w:val="22"/>
+        </w:rPr>
+      </w:pPr>
+      <w:r>
+        <w:rPr>
+          <w:rFonts w:ascii="Arial" w:hAnsi="Arial" w:eastAsia="Arial" w:cs="Arial"/>
+          <w:b w:val="0"/>
+          <w:bCs w:val="0"/>
+          <w:color w:val="000000"/>
+          <w:sz w:val="22"/>
+          <w:szCs w:val="22"/>
+          <w:highlight w:val="none"/>
+        </w:rPr>
+      </w:r>
+      <w:r>
+        <w:rPr>
+          <w:b w:val="0"/>
+          <w:bCs w:val="0"/>
+          <w:sz w:val="18"/>
+          <w:szCs w:val="18"/>
+        </w:rPr>
+      </w:r>
+      <w:r>
+        <w:rPr>
+          <w:b w:val="0"/>
+          <w:bCs w:val="0"/>
+          <w:sz w:val="22"/>
+          <w:szCs w:val="22"/>
+        </w:rPr>
+      </w:r>
+    </w:p>
+    <w:p>
+      <w:pPr>
+        <w:pBdr/>
+        <w:spacing/>
+        <w:ind/>
+        <w:contextualSpacing w:val="true"/>
+        <w:rPr>
+          <w:b w:val="0"/>
+          <w:bCs w:val="0"/>
+          <w:sz w:val="22"/>
+          <w:szCs w:val="22"/>
+        </w:rPr>
+      </w:pPr>
+      <w:r>
+        <w:rPr>
+          <w:rFonts w:ascii="Arial" w:hAnsi="Arial" w:eastAsia="Arial" w:cs="Arial"/>
+          <w:b w:val="0"/>
+          <w:bCs w:val="0"/>
+          <w:color w:val="000000"/>
+          <w:sz w:val="22"/>
+          <w:szCs w:val="22"/>
+          <w:highlight w:val="none"/>
+        </w:rPr>
+        <w:t xml:space="preserve">[new chart] </w:t>
+      </w:r>
+      <w:r>
+        <w:rPr>
+          <w:b w:val="0"/>
+          <w:bCs w:val="0"/>
+          <w:sz w:val="18"/>
+          <w:szCs w:val="18"/>
+        </w:rPr>
+      </w:r>
+      <w:r>
+        <w:rPr>
+          <w:b w:val="0"/>
+          <w:bCs w:val="0"/>
+          <w:sz w:val="22"/>
+          <w:szCs w:val="22"/>
+        </w:rPr>
+      </w:r>
+    </w:p>
+    <w:p>
+      <w:pPr>
+        <w:pBdr/>
+        <w:spacing/>
+        <w:ind/>
+        <w:contextualSpacing w:val="true"/>
+        <w:rPr>
+          <w:sz w:val="22"/>
+          <w:szCs w:val="22"/>
+        </w:rPr>
+      </w:pPr>
+      <w:r>
+        <w:rPr>
+          <w:rFonts w:ascii="Arial" w:hAnsi="Arial" w:eastAsia="Arial" w:cs="Arial"/>
+          <w:b/>
+          <w:color w:val="000000"/>
+          <w:sz w:val="22"/>
+          <w:szCs w:val="22"/>
+          <w:highlight w:val="none"/>
+        </w:rPr>
+      </w:r>
+      <w:r>
+        <w:rPr>
+          <w:sz w:val="18"/>
+          <w:szCs w:val="18"/>
+        </w:rPr>
+      </w:r>
+      <w:r>
+        <w:rPr>
+          <w:sz w:val="22"/>
+          <w:szCs w:val="22"/>
+        </w:rPr>
+      </w:r>
+    </w:p>
+    <w:p>
+      <w:pPr>
+        <w:pBdr/>
+        <w:spacing/>
+        <w:ind/>
+        <w:contextualSpacing w:val="true"/>
+        <w:rPr>
+          <w:sz w:val="22"/>
+          <w:szCs w:val="22"/>
+        </w:rPr>
+      </w:pPr>
+      <w:r>
+        <w:rPr>
+          <w:rFonts w:ascii="Arial" w:hAnsi="Arial" w:eastAsia="Arial" w:cs="Arial"/>
+          <w:b/>
+          <w:color w:val="000000"/>
+          <w:sz w:val="22"/>
+          <w:szCs w:val="22"/>
+          <w:highlight w:val="none"/>
+        </w:rPr>
+        <w:t xml:space="preserve">SC Figure 1.16.0.2 — primaryFunction() </w:t>
+      </w:r>
+      <w:r>
+        <w:rPr>
+          <w:sz w:val="18"/>
+          <w:szCs w:val="18"/>
+        </w:rPr>
+      </w:r>
+      <w:r>
+        <w:rPr>
+          <w:sz w:val="22"/>
+          <w:szCs w:val="22"/>
+        </w:rPr>
+      </w:r>
+    </w:p>
+    <w:p>
+      <w:pPr>
+        <w:pBdr/>
+        <w:spacing/>
+        <w:ind/>
+        <w:contextualSpacing w:val="true"/>
+        <w:rPr>
+          <w:sz w:val="22"/>
+          <w:szCs w:val="22"/>
+        </w:rPr>
+      </w:pPr>
+      <w:r>
+        <w:rPr>
+          <w:rFonts w:ascii="Arial" w:hAnsi="Arial" w:eastAsia="Arial" w:cs="Arial"/>
+          <w:b/>
+          <w:color w:val="000000"/>
+          <w:sz w:val="22"/>
+          <w:szCs w:val="22"/>
+          <w:highlight w:val="none"/>
+        </w:rPr>
+      </w:r>
+      <w:r>
+        <w:rPr>
+          <w:sz w:val="18"/>
+          <w:szCs w:val="18"/>
+        </w:rPr>
+      </w:r>
+      <w:r>
+        <w:rPr>
+          <w:sz w:val="22"/>
+          <w:szCs w:val="22"/>
+        </w:rPr>
+      </w:r>
+    </w:p>
+    <w:p>
+      <w:pPr>
+        <w:pBdr/>
+        <w:spacing/>
+        <w:ind/>
+        <w:contextualSpacing w:val="true"/>
+        <w:rPr>
+          <w:b w:val="0"/>
+          <w:bCs w:val="0"/>
+          <w:sz w:val="22"/>
+          <w:szCs w:val="22"/>
+        </w:rPr>
+      </w:pPr>
+      <w:r>
+        <w:rPr>
+          <w:rFonts w:ascii="Arial" w:hAnsi="Arial" w:eastAsia="Arial" w:cs="Arial"/>
+          <w:b w:val="0"/>
+          <w:bCs w:val="0"/>
+          <w:color w:val="000000"/>
+          <w:sz w:val="22"/>
+          <w:szCs w:val="22"/>
+          <w:highlight w:val="none"/>
+        </w:rPr>
+        <w:t xml:space="preserve">[new chart] </w:t>
+      </w:r>
+      <w:r>
+        <w:rPr>
+          <w:b w:val="0"/>
+          <w:bCs w:val="0"/>
+          <w:sz w:val="18"/>
+          <w:szCs w:val="18"/>
+        </w:rPr>
+      </w:r>
+      <w:r>
+        <w:rPr>
+          <w:b w:val="0"/>
+          <w:bCs w:val="0"/>
+          <w:sz w:val="22"/>
+          <w:szCs w:val="22"/>
+        </w:rPr>
+      </w:r>
+    </w:p>
+    <w:p>
+      <w:pPr>
+        <w:pBdr/>
+        <w:spacing/>
+        <w:ind/>
+        <w:contextualSpacing w:val="true"/>
+        <w:rPr>
+          <w:sz w:val="22"/>
+          <w:szCs w:val="22"/>
+        </w:rPr>
+      </w:pPr>
+      <w:r>
+        <w:rPr>
+          <w:rFonts w:ascii="Arial" w:hAnsi="Arial" w:eastAsia="Arial" w:cs="Arial"/>
+          <w:b/>
+          <w:color w:val="000000"/>
+          <w:sz w:val="22"/>
+          <w:szCs w:val="22"/>
+          <w:highlight w:val="none"/>
+        </w:rPr>
+      </w:r>
+      <w:r>
+        <w:rPr>
+          <w:sz w:val="18"/>
+          <w:szCs w:val="18"/>
+        </w:rPr>
+      </w:r>
+      <w:r>
+        <w:rPr>
+          <w:sz w:val="22"/>
+          <w:szCs w:val="22"/>
+        </w:rPr>
+      </w:r>
+    </w:p>
+    <w:p>
+      <w:pPr>
+        <w:pBdr/>
+        <w:spacing/>
+        <w:ind/>
+        <w:contextualSpacing w:val="true"/>
+        <w:rPr>
+          <w:sz w:val="22"/>
+          <w:szCs w:val="22"/>
+        </w:rPr>
+      </w:pPr>
+      <w:r>
+        <w:rPr>
+          <w:rFonts w:ascii="Arial" w:hAnsi="Arial" w:eastAsia="Arial" w:cs="Arial"/>
+          <w:b/>
+          <w:color w:val="000000"/>
+          <w:sz w:val="22"/>
+          <w:szCs w:val="22"/>
+          <w:highlight w:val="none"/>
+        </w:rPr>
+        <w:t xml:space="preserve">SC Figure 1.16.0.3 — primaryFunction() </w:t>
+      </w:r>
+      <w:r>
+        <w:rPr>
+          <w:sz w:val="18"/>
+          <w:szCs w:val="18"/>
+        </w:rPr>
+      </w:r>
+      <w:r>
+        <w:rPr>
+          <w:sz w:val="22"/>
+          <w:szCs w:val="22"/>
+        </w:rPr>
+      </w:r>
+    </w:p>
+    <w:p>
+      <w:pPr>
+        <w:pBdr/>
+        <w:spacing/>
+        <w:ind/>
+        <w:contextualSpacing w:val="true"/>
+        <w:rPr>
+          <w:sz w:val="22"/>
+          <w:szCs w:val="22"/>
+        </w:rPr>
+      </w:pPr>
+      <w:r>
+        <w:rPr>
+          <w:rFonts w:ascii="Arial" w:hAnsi="Arial" w:eastAsia="Arial" w:cs="Arial"/>
+          <w:b/>
+          <w:color w:val="000000"/>
+          <w:sz w:val="22"/>
+          <w:szCs w:val="22"/>
+          <w:highlight w:val="none"/>
+        </w:rPr>
+      </w:r>
+      <w:r>
+        <w:rPr>
+          <w:sz w:val="18"/>
+          <w:szCs w:val="18"/>
+        </w:rPr>
+      </w:r>
+      <w:r>
+        <w:rPr>
+          <w:sz w:val="22"/>
+          <w:szCs w:val="22"/>
+        </w:rPr>
+      </w:r>
+    </w:p>
+    <w:p>
+      <w:pPr>
+        <w:pBdr/>
+        <w:spacing/>
+        <w:ind/>
+        <w:contextualSpacing w:val="true"/>
+        <w:rPr>
+          <w:b w:val="0"/>
+          <w:bCs w:val="0"/>
+          <w:sz w:val="22"/>
+          <w:szCs w:val="22"/>
+        </w:rPr>
+      </w:pPr>
+      <w:r>
+        <w:rPr>
+          <w:rFonts w:ascii="Arial" w:hAnsi="Arial" w:eastAsia="Arial" w:cs="Arial"/>
+          <w:b w:val="0"/>
+          <w:bCs w:val="0"/>
+          <w:color w:val="000000"/>
+          <w:sz w:val="22"/>
+          <w:szCs w:val="22"/>
+          <w:highlight w:val="none"/>
+        </w:rPr>
+        <w:t xml:space="preserve">[new chart] </w:t>
+      </w:r>
+      <w:r>
+        <w:rPr>
+          <w:b w:val="0"/>
+          <w:bCs w:val="0"/>
+          <w:sz w:val="18"/>
+          <w:szCs w:val="18"/>
+        </w:rPr>
+      </w:r>
+      <w:r>
+        <w:rPr>
+          <w:b w:val="0"/>
+          <w:bCs w:val="0"/>
+          <w:sz w:val="22"/>
+          <w:szCs w:val="22"/>
+        </w:rPr>
+      </w:r>
+    </w:p>
+    <w:p>
+      <w:pPr>
+        <w:pBdr/>
+        <w:spacing/>
+        <w:ind/>
+        <w:contextualSpacing w:val="true"/>
+        <w:rPr>
+          <w:sz w:val="22"/>
+          <w:szCs w:val="22"/>
+        </w:rPr>
+      </w:pPr>
+      <w:r>
+        <w:rPr>
+          <w:rFonts w:ascii="Arial" w:hAnsi="Arial" w:eastAsia="Arial" w:cs="Arial"/>
+          <w:b/>
+          <w:color w:val="000000"/>
+          <w:sz w:val="22"/>
+          <w:szCs w:val="22"/>
+          <w:highlight w:val="none"/>
+        </w:rPr>
+      </w:r>
+      <w:r>
+        <w:rPr>
+          <w:sz w:val="18"/>
+          <w:szCs w:val="18"/>
+        </w:rPr>
+      </w:r>
+      <w:r>
+        <w:rPr>
+          <w:sz w:val="22"/>
+          <w:szCs w:val="22"/>
+        </w:rPr>
+      </w:r>
+    </w:p>
+    <w:p>
+      <w:pPr>
+        <w:pBdr/>
+        <w:spacing/>
+        <w:ind/>
+        <w:contextualSpacing w:val="true"/>
+        <w:rPr>
+          <w:sz w:val="22"/>
+          <w:szCs w:val="22"/>
+        </w:rPr>
+      </w:pPr>
+      <w:r>
+        <w:rPr>
+          <w:rFonts w:ascii="Arial" w:hAnsi="Arial" w:eastAsia="Arial" w:cs="Arial"/>
+          <w:b/>
+          <w:color w:val="000000"/>
+          <w:sz w:val="22"/>
+          <w:szCs w:val="22"/>
+          <w:highlight w:val="none"/>
+        </w:rPr>
+        <w:t xml:space="preserve">SC Figure 1.16.0.4 — primaryFunction() </w:t>
+      </w:r>
+      <w:r>
+        <w:rPr>
+          <w:sz w:val="18"/>
+          <w:szCs w:val="18"/>
+        </w:rPr>
+      </w:r>
+      <w:r>
+        <w:rPr>
+          <w:sz w:val="22"/>
+          <w:szCs w:val="22"/>
+        </w:rPr>
+      </w:r>
+    </w:p>
+    <w:p>
+      <w:pPr>
+        <w:pBdr/>
+        <w:spacing/>
+        <w:ind/>
+        <w:contextualSpacing w:val="true"/>
+        <w:rPr>
+          <w:sz w:val="22"/>
+          <w:szCs w:val="22"/>
+        </w:rPr>
+      </w:pPr>
+      <w:r>
+        <w:rPr>
+          <w:rFonts w:ascii="Arial" w:hAnsi="Arial" w:eastAsia="Arial" w:cs="Arial"/>
+          <w:b/>
+          <w:color w:val="000000"/>
+          <w:sz w:val="22"/>
+          <w:szCs w:val="22"/>
+          <w:highlight w:val="none"/>
+        </w:rPr>
+      </w:r>
+      <w:r>
+        <w:rPr>
+          <w:sz w:val="18"/>
+          <w:szCs w:val="18"/>
+        </w:rPr>
+      </w:r>
+      <w:r>
+        <w:rPr>
+          <w:sz w:val="22"/>
+          <w:szCs w:val="22"/>
+        </w:rPr>
+      </w:r>
+    </w:p>
+    <w:p>
+      <w:pPr>
+        <w:pBdr/>
+        <w:spacing/>
+        <w:ind/>
+        <w:contextualSpacing w:val="true"/>
+        <w:rPr>
+          <w:b w:val="0"/>
+          <w:bCs w:val="0"/>
+          <w:sz w:val="22"/>
+          <w:szCs w:val="22"/>
+        </w:rPr>
+      </w:pPr>
+      <w:r>
+        <w:rPr>
+          <w:rFonts w:ascii="Arial" w:hAnsi="Arial" w:eastAsia="Arial" w:cs="Arial"/>
+          <w:b w:val="0"/>
+          <w:bCs w:val="0"/>
+          <w:color w:val="000000"/>
+          <w:sz w:val="22"/>
+          <w:szCs w:val="22"/>
+          <w:highlight w:val="none"/>
+        </w:rPr>
+        <w:t xml:space="preserve">[new chart] </w:t>
+      </w:r>
+      <w:r>
+        <w:rPr>
+          <w:b w:val="0"/>
+          <w:bCs w:val="0"/>
+          <w:sz w:val="18"/>
+          <w:szCs w:val="18"/>
+        </w:rPr>
+      </w:r>
+      <w:r>
+        <w:rPr>
+          <w:b w:val="0"/>
+          <w:bCs w:val="0"/>
+          <w:sz w:val="22"/>
+          <w:szCs w:val="22"/>
+        </w:rPr>
+      </w:r>
+    </w:p>
+    <w:p>
+      <w:pPr>
+        <w:pBdr/>
+        <w:spacing/>
+        <w:ind/>
+        <w:rPr>
+          <w:rFonts w:ascii="Arial" w:hAnsi="Arial" w:cs="Arial"/>
+          <w:highlight w:val="none"/>
+        </w:rPr>
+      </w:pPr>
+      <w:r>
+        <w:rPr>
+          <w:rFonts w:ascii="Arial" w:hAnsi="Arial" w:cs="Arial"/>
+          <w:highlight w:val="none"/>
+        </w:rPr>
+      </w:r>
+      <w:r>
+        <w:rPr>
+          <w:rFonts w:ascii="Arial" w:hAnsi="Arial" w:cs="Arial"/>
+          <w:highlight w:val="none"/>
+        </w:rPr>
+      </w:r>
+      <w:r>
+        <w:rPr>
+          <w:rFonts w:ascii="Arial" w:hAnsi="Arial" w:cs="Arial"/>
+          <w:highlight w:val="none"/>
+        </w:rPr>
+      </w:r>
+    </w:p>
+    <w:p>
+      <w:pPr>
+        <w:pBdr>
+          <w:top w:val="none" w:color="000000" w:sz="4" w:space="0"/>
+          <w:left w:val="none" w:color="000000" w:sz="4" w:space="0"/>
+          <w:bottom w:val="none" w:color="000000" w:sz="4" w:space="0"/>
+          <w:right w:val="none" w:color="000000" w:sz="4" w:space="0"/>
+        </w:pBdr>
+        <w:shd w:val="clear" w:color="ffffff" w:fill="ffffff"/>
+        <w:spacing w:after="80" w:before="360"/>
+        <w:ind w:right="0" w:firstLine="0" w:left="0"/>
         <w:rPr>
           <w:rFonts w:ascii="Arial" w:hAnsi="Arial" w:eastAsia="Arial" w:cs="Arial"/>
           <w:b/>
@@ -1805,545 +2524,6 @@
     </w:p>
     <w:p>
       <w:pPr>
-        <w:pBdr/>
-        <w:spacing/>
-        <w:ind/>
-        <w:contextualSpacing w:val="true"/>
-        <w:rPr>
-          <w:sz w:val="22"/>
-          <w:szCs w:val="22"/>
-        </w:rPr>
-      </w:pPr>
-      <w:r>
-        <w:rPr>
-          <w:rFonts w:ascii="Arial" w:hAnsi="Arial" w:eastAsia="Arial" w:cs="Arial"/>
-          <w:b/>
-          <w:color w:val="000000"/>
-          <w:sz w:val="22"/>
-          <w:szCs w:val="22"/>
-          <w:highlight w:val="none"/>
-        </w:rPr>
-        <w:t xml:space="preserve">Structure Charts — Fictitious Service </w:t>
-      </w:r>
-      <w:r>
-        <w:rPr>
-          <w:sz w:val="18"/>
-          <w:szCs w:val="18"/>
-        </w:rPr>
-      </w:r>
-    </w:p>
-    <w:p>
-      <w:pPr>
-        <w:pBdr/>
-        <w:spacing/>
-        <w:ind/>
-        <w:contextualSpacing w:val="true"/>
-        <w:rPr>
-          <w:sz w:val="22"/>
-          <w:szCs w:val="22"/>
-        </w:rPr>
-      </w:pPr>
-      <w:r>
-        <w:rPr>
-          <w:rFonts w:ascii="Arial" w:hAnsi="Arial" w:eastAsia="Arial" w:cs="Arial"/>
-          <w:b/>
-          <w:color w:val="000000"/>
-          <w:sz w:val="22"/>
-          <w:szCs w:val="22"/>
-          <w:highlight w:val="none"/>
-        </w:rPr>
-      </w:r>
-      <w:r>
-        <w:rPr>
-          <w:sz w:val="18"/>
-          <w:szCs w:val="18"/>
-        </w:rPr>
-      </w:r>
-    </w:p>
-    <w:p>
-      <w:pPr>
-        <w:pBdr/>
-        <w:spacing/>
-        <w:ind/>
-        <w:contextualSpacing w:val="true"/>
-        <w:rPr>
-          <w:sz w:val="22"/>
-          <w:szCs w:val="22"/>
-        </w:rPr>
-      </w:pPr>
-      <w:r>
-        <w:rPr>
-          <w:rFonts w:ascii="Arial" w:hAnsi="Arial" w:eastAsia="Arial" w:cs="Arial"/>
-          <w:b/>
-          <w:color w:val="000000"/>
-          <w:sz w:val="22"/>
-          <w:szCs w:val="22"/>
-          <w:highlight w:val="none"/>
-        </w:rPr>
-        <w:t xml:space="preserve">SC Figure 1.16.0.1 — primaryFunction() </w:t>
-      </w:r>
-      <w:r>
-        <w:rPr>
-          <w:sz w:val="18"/>
-          <w:szCs w:val="18"/>
-        </w:rPr>
-      </w:r>
-    </w:p>
-    <w:p>
-      <w:pPr>
-        <w:pBdr/>
-        <w:spacing/>
-        <w:ind/>
-        <w:contextualSpacing w:val="true"/>
-        <w:rPr>
-          <w:b w:val="0"/>
-          <w:bCs w:val="0"/>
-          <w:sz w:val="22"/>
-          <w:szCs w:val="22"/>
-        </w:rPr>
-      </w:pPr>
-      <w:r>
-        <w:rPr>
-          <w:rFonts w:ascii="Arial" w:hAnsi="Arial" w:eastAsia="Arial" w:cs="Arial"/>
-          <w:b w:val="0"/>
-          <w:bCs w:val="0"/>
-          <w:color w:val="000000"/>
-          <w:sz w:val="22"/>
-          <w:szCs w:val="22"/>
-          <w:highlight w:val="none"/>
-        </w:rPr>
-      </w:r>
-      <w:r>
-        <w:rPr>
-          <w:b w:val="0"/>
-          <w:bCs w:val="0"/>
-          <w:sz w:val="18"/>
-          <w:szCs w:val="18"/>
-        </w:rPr>
-      </w:r>
-    </w:p>
-    <w:p>
-      <w:pPr>
-        <w:pBdr/>
-        <w:spacing/>
-        <w:ind/>
-        <w:contextualSpacing w:val="true"/>
-        <w:rPr>
-          <w:b w:val="0"/>
-          <w:bCs w:val="0"/>
-          <w:sz w:val="22"/>
-          <w:szCs w:val="22"/>
-        </w:rPr>
-      </w:pPr>
-      <w:r>
-        <w:rPr>
-          <w:rFonts w:ascii="Arial" w:hAnsi="Arial" w:eastAsia="Arial" w:cs="Arial"/>
-          <w:b w:val="0"/>
-          <w:bCs w:val="0"/>
-          <w:color w:val="000000"/>
-          <w:sz w:val="22"/>
-          <w:szCs w:val="22"/>
-          <w:highlight w:val="none"/>
-        </w:rPr>
-        <w:t xml:space="preserve">[new chart] </w:t>
-      </w:r>
-      <w:r>
-        <w:rPr>
-          <w:b w:val="0"/>
-          <w:bCs w:val="0"/>
-          <w:sz w:val="18"/>
-          <w:szCs w:val="18"/>
-        </w:rPr>
-      </w:r>
-    </w:p>
-    <w:p>
-      <w:pPr>
-        <w:pBdr/>
-        <w:spacing/>
-        <w:ind/>
-        <w:contextualSpacing w:val="true"/>
-        <w:rPr>
-          <w:sz w:val="22"/>
-          <w:szCs w:val="22"/>
-        </w:rPr>
-      </w:pPr>
-      <w:r>
-        <w:rPr>
-          <w:rFonts w:ascii="Arial" w:hAnsi="Arial" w:eastAsia="Arial" w:cs="Arial"/>
-          <w:b/>
-          <w:color w:val="000000"/>
-          <w:sz w:val="22"/>
-          <w:szCs w:val="22"/>
-          <w:highlight w:val="none"/>
-        </w:rPr>
-      </w:r>
-      <w:r>
-        <w:rPr>
-          <w:sz w:val="18"/>
-          <w:szCs w:val="18"/>
-        </w:rPr>
-      </w:r>
-    </w:p>
-    <w:p>
-      <w:pPr>
-        <w:pBdr/>
-        <w:spacing/>
-        <w:ind/>
-        <w:contextualSpacing w:val="true"/>
-        <w:rPr>
-          <w:sz w:val="22"/>
-          <w:szCs w:val="22"/>
-        </w:rPr>
-      </w:pPr>
-      <w:r>
-        <w:rPr>
-          <w:rFonts w:ascii="Arial" w:hAnsi="Arial" w:eastAsia="Arial" w:cs="Arial"/>
-          <w:b/>
-          <w:color w:val="000000"/>
-          <w:sz w:val="22"/>
-          <w:szCs w:val="22"/>
-          <w:highlight w:val="none"/>
-        </w:rPr>
-        <w:t xml:space="preserve">SC Figure 1.16.0.2 — primaryFunction() </w:t>
-      </w:r>
-      <w:r>
-        <w:rPr>
-          <w:sz w:val="18"/>
-          <w:szCs w:val="18"/>
-        </w:rPr>
-      </w:r>
-    </w:p>
-    <w:p>
-      <w:pPr>
-        <w:pBdr/>
-        <w:spacing/>
-        <w:ind/>
-        <w:contextualSpacing w:val="true"/>
-        <w:rPr>
-          <w:sz w:val="22"/>
-          <w:szCs w:val="22"/>
-        </w:rPr>
-      </w:pPr>
-      <w:r>
-        <w:rPr>
-          <w:rFonts w:ascii="Arial" w:hAnsi="Arial" w:eastAsia="Arial" w:cs="Arial"/>
-          <w:b/>
-          <w:color w:val="000000"/>
-          <w:sz w:val="22"/>
-          <w:szCs w:val="22"/>
-          <w:highlight w:val="none"/>
-        </w:rPr>
-      </w:r>
-      <w:r>
-        <w:rPr>
-          <w:sz w:val="18"/>
-          <w:szCs w:val="18"/>
-        </w:rPr>
-      </w:r>
-    </w:p>
-    <w:p>
-      <w:pPr>
-        <w:pBdr/>
-        <w:spacing/>
-        <w:ind/>
-        <w:contextualSpacing w:val="true"/>
-        <w:rPr>
-          <w:b w:val="0"/>
-          <w:bCs w:val="0"/>
-          <w:sz w:val="22"/>
-          <w:szCs w:val="22"/>
-        </w:rPr>
-      </w:pPr>
-      <w:r>
-        <w:rPr>
-          <w:rFonts w:ascii="Arial" w:hAnsi="Arial" w:eastAsia="Arial" w:cs="Arial"/>
-          <w:b w:val="0"/>
-          <w:bCs w:val="0"/>
-          <w:color w:val="000000"/>
-          <w:sz w:val="22"/>
-          <w:szCs w:val="22"/>
-          <w:highlight w:val="none"/>
-        </w:rPr>
-        <w:t xml:space="preserve">[new chart] </w:t>
-      </w:r>
-      <w:r>
-        <w:rPr>
-          <w:b w:val="0"/>
-          <w:bCs w:val="0"/>
-          <w:sz w:val="18"/>
-          <w:szCs w:val="18"/>
-        </w:rPr>
-      </w:r>
-    </w:p>
-    <w:p>
-      <w:pPr>
-        <w:pBdr/>
-        <w:spacing/>
-        <w:ind/>
-        <w:contextualSpacing w:val="true"/>
-        <w:rPr>
-          <w:sz w:val="22"/>
-          <w:szCs w:val="22"/>
-        </w:rPr>
-      </w:pPr>
-      <w:r>
-        <w:rPr>
-          <w:rFonts w:ascii="Arial" w:hAnsi="Arial" w:eastAsia="Arial" w:cs="Arial"/>
-          <w:b/>
-          <w:color w:val="000000"/>
-          <w:sz w:val="22"/>
-          <w:szCs w:val="22"/>
-          <w:highlight w:val="none"/>
-        </w:rPr>
-      </w:r>
-      <w:r>
-        <w:rPr>
-          <w:sz w:val="18"/>
-          <w:szCs w:val="18"/>
-        </w:rPr>
-      </w:r>
-    </w:p>
-    <w:p>
-      <w:pPr>
-        <w:pBdr/>
-        <w:spacing/>
-        <w:ind/>
-        <w:contextualSpacing w:val="true"/>
-        <w:rPr>
-          <w:sz w:val="22"/>
-          <w:szCs w:val="22"/>
-        </w:rPr>
-      </w:pPr>
-      <w:r>
-        <w:rPr>
-          <w:rFonts w:ascii="Arial" w:hAnsi="Arial" w:eastAsia="Arial" w:cs="Arial"/>
-          <w:b/>
-          <w:color w:val="000000"/>
-          <w:sz w:val="22"/>
-          <w:szCs w:val="22"/>
-          <w:highlight w:val="none"/>
-        </w:rPr>
-        <w:t xml:space="preserve">SC Figure 1.16.0.3 — primaryFunction() </w:t>
-      </w:r>
-      <w:r>
-        <w:rPr>
-          <w:sz w:val="18"/>
-          <w:szCs w:val="18"/>
-        </w:rPr>
-      </w:r>
-    </w:p>
-    <w:p>
-      <w:pPr>
-        <w:pBdr/>
-        <w:spacing/>
-        <w:ind/>
-        <w:contextualSpacing w:val="true"/>
-        <w:rPr>
-          <w:sz w:val="22"/>
-          <w:szCs w:val="22"/>
-        </w:rPr>
-      </w:pPr>
-      <w:r>
-        <w:rPr>
-          <w:rFonts w:ascii="Arial" w:hAnsi="Arial" w:eastAsia="Arial" w:cs="Arial"/>
-          <w:b/>
-          <w:color w:val="000000"/>
-          <w:sz w:val="22"/>
-          <w:szCs w:val="22"/>
-          <w:highlight w:val="none"/>
-        </w:rPr>
-      </w:r>
-      <w:r>
-        <w:rPr>
-          <w:sz w:val="18"/>
-          <w:szCs w:val="18"/>
-        </w:rPr>
-      </w:r>
-    </w:p>
-    <w:p>
-      <w:pPr>
-        <w:pBdr/>
-        <w:spacing/>
-        <w:ind/>
-        <w:contextualSpacing w:val="true"/>
-        <w:rPr>
-          <w:b w:val="0"/>
-          <w:bCs w:val="0"/>
-          <w:sz w:val="22"/>
-          <w:szCs w:val="22"/>
-        </w:rPr>
-      </w:pPr>
-      <w:r>
-        <w:rPr>
-          <w:rFonts w:ascii="Arial" w:hAnsi="Arial" w:eastAsia="Arial" w:cs="Arial"/>
-          <w:b w:val="0"/>
-          <w:bCs w:val="0"/>
-          <w:color w:val="000000"/>
-          <w:sz w:val="22"/>
-          <w:szCs w:val="22"/>
-          <w:highlight w:val="none"/>
-        </w:rPr>
-        <w:t xml:space="preserve">[new chart] </w:t>
-      </w:r>
-      <w:r>
-        <w:rPr>
-          <w:b w:val="0"/>
-          <w:bCs w:val="0"/>
-          <w:sz w:val="18"/>
-          <w:szCs w:val="18"/>
-        </w:rPr>
-      </w:r>
-    </w:p>
-    <w:p>
-      <w:pPr>
-        <w:pBdr/>
-        <w:spacing/>
-        <w:ind/>
-        <w:contextualSpacing w:val="true"/>
-        <w:rPr>
-          <w:sz w:val="22"/>
-          <w:szCs w:val="22"/>
-        </w:rPr>
-      </w:pPr>
-      <w:r>
-        <w:rPr>
-          <w:rFonts w:ascii="Arial" w:hAnsi="Arial" w:eastAsia="Arial" w:cs="Arial"/>
-          <w:b/>
-          <w:color w:val="000000"/>
-          <w:sz w:val="22"/>
-          <w:szCs w:val="22"/>
-          <w:highlight w:val="none"/>
-        </w:rPr>
-      </w:r>
-      <w:r>
-        <w:rPr>
-          <w:sz w:val="18"/>
-          <w:szCs w:val="18"/>
-        </w:rPr>
-      </w:r>
-    </w:p>
-    <w:p>
-      <w:pPr>
-        <w:pBdr/>
-        <w:spacing/>
-        <w:ind/>
-        <w:contextualSpacing w:val="true"/>
-        <w:rPr>
-          <w:sz w:val="22"/>
-          <w:szCs w:val="22"/>
-        </w:rPr>
-      </w:pPr>
-      <w:r>
-        <w:rPr>
-          <w:rFonts w:ascii="Arial" w:hAnsi="Arial" w:eastAsia="Arial" w:cs="Arial"/>
-          <w:b/>
-          <w:color w:val="000000"/>
-          <w:sz w:val="22"/>
-          <w:szCs w:val="22"/>
-          <w:highlight w:val="none"/>
-        </w:rPr>
-        <w:t xml:space="preserve">SC Figure 1.16.0.4 — primaryFunction() </w:t>
-      </w:r>
-      <w:r>
-        <w:rPr>
-          <w:sz w:val="18"/>
-          <w:szCs w:val="18"/>
-        </w:rPr>
-      </w:r>
-    </w:p>
-    <w:p>
-      <w:pPr>
-        <w:pBdr/>
-        <w:spacing/>
-        <w:ind/>
-        <w:contextualSpacing w:val="true"/>
-        <w:rPr>
-          <w:sz w:val="22"/>
-          <w:szCs w:val="22"/>
-        </w:rPr>
-      </w:pPr>
-      <w:r>
-        <w:rPr>
-          <w:rFonts w:ascii="Arial" w:hAnsi="Arial" w:eastAsia="Arial" w:cs="Arial"/>
-          <w:b/>
-          <w:color w:val="000000"/>
-          <w:sz w:val="22"/>
-          <w:szCs w:val="22"/>
-          <w:highlight w:val="none"/>
-        </w:rPr>
-      </w:r>
-      <w:r>
-        <w:rPr>
-          <w:sz w:val="18"/>
-          <w:szCs w:val="18"/>
-        </w:rPr>
-      </w:r>
-    </w:p>
-    <w:p>
-      <w:pPr>
-        <w:pBdr/>
-        <w:spacing/>
-        <w:ind/>
-        <w:contextualSpacing w:val="true"/>
-        <w:rPr>
-          <w:b w:val="0"/>
-          <w:bCs w:val="0"/>
-          <w:sz w:val="22"/>
-          <w:szCs w:val="22"/>
-        </w:rPr>
-      </w:pPr>
-      <w:r>
-        <w:rPr>
-          <w:rFonts w:ascii="Arial" w:hAnsi="Arial" w:eastAsia="Arial" w:cs="Arial"/>
-          <w:b w:val="0"/>
-          <w:bCs w:val="0"/>
-          <w:color w:val="000000"/>
-          <w:sz w:val="22"/>
-          <w:szCs w:val="22"/>
-          <w:highlight w:val="none"/>
-        </w:rPr>
-        <w:t xml:space="preserve">[new chart] </w:t>
-      </w:r>
-      <w:r>
-        <w:rPr>
-          <w:b w:val="0"/>
-          <w:bCs w:val="0"/>
-          <w:sz w:val="18"/>
-          <w:szCs w:val="18"/>
-        </w:rPr>
-      </w:r>
-    </w:p>
-    <w:p>
-      <w:pPr>
-        <w:pBdr/>
-        <w:spacing/>
-        <w:ind/>
-        <w:rPr>
-          <w:rFonts w:ascii="Arial" w:hAnsi="Arial" w:cs="Arial"/>
-          <w:highlight w:val="none"/>
-        </w:rPr>
-      </w:pPr>
-      <w:r>
-        <w:rPr>
-          <w:rFonts w:ascii="Arial" w:hAnsi="Arial" w:cs="Arial"/>
-          <w:highlight w:val="none"/>
-        </w:rPr>
-      </w:r>
-      <w:r>
-        <w:rPr>
-          <w:rFonts w:ascii="Arial" w:hAnsi="Arial" w:cs="Arial"/>
-          <w:highlight w:val="none"/>
-        </w:rPr>
-      </w:r>
-      <w:r>
-        <w:rPr>
-          <w:rFonts w:ascii="Arial" w:hAnsi="Arial" w:cs="Arial"/>
-          <w:highlight w:val="none"/>
-        </w:rPr>
-      </w:r>
-    </w:p>
-    <w:p>
-      <w:pPr>
         <w:pBdr>
           <w:top w:val="none" w:color="000000" w:sz="4" w:space="0"/>
           <w:left w:val="none" w:color="000000" w:sz="4" w:space="0"/>
@@ -2370,14 +2550,174 @@
           <w:color w:val="000000"/>
           <w:sz w:val="28"/>
           <w:szCs w:val="28"/>
+          <w:highlight w:val="none"/>
+        </w:rPr>
+      </w:r>
+      <w:r>
+        <w:rPr>
+          <w:rFonts w:ascii="Arial" w:hAnsi="Arial" w:eastAsia="Arial" w:cs="Arial"/>
+          <w:b/>
+          <w:color w:val="000000"/>
+          <w:sz w:val="28"/>
+          <w:szCs w:val="28"/>
+          <w:highlight w:val="none"/>
+        </w:rPr>
+      </w:r>
+      <w:r>
+        <w:rPr>
+          <w:rFonts w:ascii="Arial" w:hAnsi="Arial" w:eastAsia="Arial" w:cs="Arial"/>
+          <w:b/>
+          <w:color w:val="000000"/>
+          <w:sz w:val="28"/>
+          <w:szCs w:val="28"/>
+          <w:highlight w:val="none"/>
+        </w:rPr>
+      </w:r>
+    </w:p>
+    <w:p>
+      <w:pPr>
+        <w:pBdr>
+          <w:top w:val="none" w:color="000000" w:sz="4" w:space="0"/>
+          <w:left w:val="none" w:color="000000" w:sz="4" w:space="0"/>
+          <w:bottom w:val="none" w:color="000000" w:sz="4" w:space="0"/>
+          <w:right w:val="none" w:color="000000" w:sz="4" w:space="0"/>
+        </w:pBdr>
+        <w:shd w:val="clear" w:color="ffffff" w:fill="ffffff"/>
+        <w:spacing w:after="80" w:before="360"/>
+        <w:ind w:right="0" w:firstLine="0" w:left="0"/>
+        <w:rPr>
+          <w:rFonts w:ascii="Arial" w:hAnsi="Arial" w:eastAsia="Arial" w:cs="Arial"/>
+          <w:b/>
+          <w:bCs/>
+          <w:color w:val="000000"/>
+          <w:sz w:val="28"/>
+          <w:szCs w:val="28"/>
+          <w:highlight w:val="none"/>
+        </w:rPr>
+      </w:pPr>
+      <w:r>
+        <w:rPr>
+          <w:rFonts w:ascii="Arial" w:hAnsi="Arial" w:eastAsia="Arial" w:cs="Arial"/>
+          <w:b/>
+          <w:color w:val="000000"/>
+          <w:sz w:val="28"/>
+          <w:szCs w:val="28"/>
+          <w:highlight w:val="none"/>
+        </w:rPr>
+      </w:r>
+      <w:r>
+        <w:rPr>
+          <w:rFonts w:ascii="Arial" w:hAnsi="Arial" w:eastAsia="Arial" w:cs="Arial"/>
+          <w:b/>
+          <w:color w:val="000000"/>
+          <w:sz w:val="28"/>
+          <w:szCs w:val="28"/>
+          <w:highlight w:val="none"/>
+        </w:rPr>
+      </w:r>
+      <w:r>
+        <w:rPr>
+          <w:rFonts w:ascii="Arial" w:hAnsi="Arial" w:eastAsia="Arial" w:cs="Arial"/>
+          <w:b/>
+          <w:color w:val="000000"/>
+          <w:sz w:val="28"/>
+          <w:szCs w:val="28"/>
+          <w:highlight w:val="none"/>
+        </w:rPr>
+      </w:r>
+    </w:p>
+    <w:p>
+      <w:pPr>
+        <w:pBdr>
+          <w:top w:val="none" w:color="000000" w:sz="4" w:space="0"/>
+          <w:left w:val="none" w:color="000000" w:sz="4" w:space="0"/>
+          <w:bottom w:val="none" w:color="000000" w:sz="4" w:space="0"/>
+          <w:right w:val="none" w:color="000000" w:sz="4" w:space="0"/>
+        </w:pBdr>
+        <w:shd w:val="clear" w:color="ffffff" w:fill="ffffff"/>
+        <w:spacing w:after="80" w:before="360"/>
+        <w:ind w:right="0" w:firstLine="0" w:left="0"/>
+        <w:rPr>
+          <w:rFonts w:ascii="Arial" w:hAnsi="Arial" w:eastAsia="Arial" w:cs="Arial"/>
+          <w:b/>
+          <w:bCs/>
+          <w:color w:val="000000"/>
+          <w:sz w:val="28"/>
+          <w:szCs w:val="28"/>
+          <w:highlight w:val="none"/>
+        </w:rPr>
+      </w:pPr>
+      <w:r>
+        <w:rPr>
+          <w:rFonts w:ascii="Arial" w:hAnsi="Arial" w:eastAsia="Arial" w:cs="Arial"/>
+          <w:b/>
+          <w:color w:val="000000"/>
+          <w:sz w:val="28"/>
+          <w:szCs w:val="28"/>
+          <w:highlight w:val="none"/>
+        </w:rPr>
+      </w:r>
+      <w:r>
+        <w:rPr>
+          <w:rFonts w:ascii="Arial" w:hAnsi="Arial" w:eastAsia="Arial" w:cs="Arial"/>
+          <w:b/>
+          <w:color w:val="000000"/>
+          <w:sz w:val="28"/>
+          <w:szCs w:val="28"/>
+          <w:highlight w:val="none"/>
+        </w:rPr>
+      </w:r>
+      <w:r>
+        <w:rPr>
+          <w:rFonts w:ascii="Arial" w:hAnsi="Arial" w:eastAsia="Arial" w:cs="Arial"/>
+          <w:b/>
+          <w:color w:val="000000"/>
+          <w:sz w:val="28"/>
+          <w:szCs w:val="28"/>
+          <w:highlight w:val="none"/>
+        </w:rPr>
+      </w:r>
+    </w:p>
+    <w:p>
+      <w:pPr>
+        <w:pBdr>
+          <w:top w:val="none" w:color="000000" w:sz="4" w:space="0"/>
+          <w:left w:val="none" w:color="000000" w:sz="4" w:space="0"/>
+          <w:bottom w:val="none" w:color="000000" w:sz="4" w:space="0"/>
+          <w:right w:val="none" w:color="000000" w:sz="4" w:space="0"/>
+        </w:pBdr>
+        <w:shd w:val="clear" w:color="ffffff" w:fill="ffffff"/>
+        <w:spacing w:after="80" w:before="360"/>
+        <w:ind w:right="0" w:firstLine="0" w:left="0"/>
+        <w:rPr>
+          <w:rFonts w:ascii="Arial" w:hAnsi="Arial" w:eastAsia="Arial" w:cs="Arial"/>
+          <w:b/>
+          <w:bCs/>
+          <w:color w:val="000000"/>
+          <w:sz w:val="28"/>
+          <w:szCs w:val="28"/>
+          <w:highlight w:val="none"/>
+        </w:rPr>
+      </w:pPr>
+      <w:r>
+        <w:rPr>
+          <w:rFonts w:ascii="Arial" w:hAnsi="Arial" w:eastAsia="Arial" w:cs="Arial"/>
+          <w:b/>
+          <w:color w:val="000000"/>
+          <w:sz w:val="28"/>
+          <w:szCs w:val="28"/>
         </w:rPr>
         <w:t xml:space="preserve">More On Structure Charts</w:t>
       </w:r>
       <w:r>
         <w:rPr>
-          <w:rFonts w:ascii="Arial" w:hAnsi="Arial" w:cs="Arial"/>
+          <w:rFonts w:ascii="Arial" w:hAnsi="Arial" w:eastAsia="Arial" w:cs="Arial"/>
+          <w:b/>
+          <w:bCs/>
+          <w:color w:val="000000"/>
           <w:sz w:val="28"/>
           <w:szCs w:val="28"/>
+          <w:highlight w:val="none"/>
         </w:rPr>
       </w:r>
       <w:r>
@@ -2502,9 +2842,13 @@
       </w:r>
       <w:r>
         <w:rPr>
-          <w:rFonts w:ascii="Arial" w:hAnsi="Arial" w:cs="Arial"/>
+          <w:rFonts w:ascii="Arial" w:hAnsi="Arial" w:eastAsia="Arial" w:cs="Arial"/>
+          <w:b/>
+          <w:bCs/>
+          <w:color w:val="000000"/>
           <w:sz w:val="28"/>
           <w:szCs w:val="28"/>
+          <w:highlight w:val="none"/>
         </w:rPr>
       </w:r>
       <w:r>
@@ -2693,12 +3037,9 @@
       </w:r>
       <w:r>
         <w:rPr>
-          <w:rFonts w:ascii="Arial" w:hAnsi="Arial" w:eastAsia="Arial" w:cs="Arial"/>
-          <w:b/>
-          <w:color w:val="000000"/>
+          <w:rFonts w:ascii="Arial" w:hAnsi="Arial" w:cs="Arial"/>
           <w:sz w:val="28"/>
           <w:szCs w:val="28"/>
-          <w:highlight w:val="none"/>
         </w:rPr>
       </w:r>
       <w:r>
@@ -2727,7 +3068,7 @@
       </w:r>
       <w:r>
         <w:rPr>
-          <w:rFonts w:ascii="Arial" w:hAnsi="Arial" w:eastAsia="Arial" w:cs="Arial"/>
+          <w:rFonts w:ascii="Arial" w:hAnsi="Arial" w:cs="Arial"/>
           <w:highlight w:val="none"/>
         </w:rPr>
       </w:r>
@@ -2761,7 +3102,7 @@
       </w:r>
       <w:r>
         <w:rPr>
-          <w:rFonts w:ascii="Arial" w:hAnsi="Arial" w:cs="Arial"/>
+          <w:rFonts w:ascii="Arial" w:hAnsi="Arial" w:eastAsia="Arial" w:cs="Arial"/>
           <w:highlight w:val="none"/>
         </w:rPr>
       </w:r>
@@ -2891,7 +3232,9 @@
       </w:r>
       <w:r>
         <w:rPr>
-          <w:rFonts w:eastAsia="Times New Roman" w:cs="Times New Roman"/>
+          <w:rFonts w:ascii="Arial" w:hAnsi="Arial" w:cs="Arial"/>
+          <w:b/>
+          <w:bCs/>
           <w:highlight w:val="none"/>
         </w:rPr>
       </w:r>
@@ -3022,6 +3365,7 @@
           <w:bCs w:val="0"/>
           <w:highlight w:val="none"/>
         </w:rPr>
+        <w:t xml:space="preserve">, bold</w:t>
       </w:r>
       <w:r>
         <w:rPr>
@@ -3065,8 +3409,6 @@
       </w:r>
       <w:r>
         <w:rPr>
-          <w:b w:val="0"/>
-          <w:bCs w:val="0"/>
           <w:highlight w:val="none"/>
         </w:rPr>
       </w:r>
@@ -3305,7 +3647,6 @@
         <w:rPr>
           <w:sz w:val="40"/>
           <w:szCs w:val="40"/>
-          <w:highlight w:val="none"/>
         </w:rPr>
       </w:r>
       <w:r>
@@ -3402,49 +3743,6 @@
         </w:rPr>
         <w:t xml:space="preserve">01_Standards/MIlestone_3_components/Component_Numbers_for_Teams.pdf</w:t>
       </w:r>
-      <w:r>
-        <w:rPr>
-          <w:sz w:val="24"/>
-          <w:szCs w:val="24"/>
-          <w:highlight w:val="none"/>
-        </w:rPr>
-      </w:r>
-      <w:r/>
-    </w:p>
-    <w:p>
-      <w:pPr>
-        <w:pStyle w:val="922"/>
-        <w:numPr>
-          <w:ilvl w:val="0"/>
-          <w:numId w:val="3"/>
-        </w:numPr>
-        <w:pBdr/>
-        <w:spacing/>
-        <w:ind/>
-        <w:rPr/>
-      </w:pPr>
-      <w:r>
-        <w:rPr>
-          <w:sz w:val="24"/>
-          <w:szCs w:val="24"/>
-          <w:highlight w:val="none"/>
-        </w:rPr>
-      </w:r>
-      <w:r>
-        <w:rPr>
-          <w:sz w:val="24"/>
-          <w:szCs w:val="24"/>
-          <w:highlight w:val="none"/>
-        </w:rPr>
-        <w:t xml:space="preserve">01_Standards/MIlestone_3_components/Component_Numbers_for_Teams.pdf</w:t>
-      </w:r>
-      <w:r>
-        <w:rPr>
-          <w:sz w:val="24"/>
-          <w:szCs w:val="24"/>
-          <w:highlight w:val="none"/>
-        </w:rPr>
-      </w:r>
       <w:r/>
     </w:p>
     <w:p>
@@ -3865,6 +4163,11 @@
       </w:pPr>
       <w:r>
         <w:t xml:space="preserve">Labels</w:t>
+      </w:r>
+      <w:r>
+        <w:rPr>
+          <w:highlight w:val="none"/>
+        </w:rPr>
       </w:r>
       <w:r>
         <w:rPr>

</xml_diff>